<commit_message>
Shiny app update and moderator meta analysis
</commit_message>
<xml_diff>
--- a/Meta_analysis_notes/Meta analysis notes.docx
+++ b/Meta_analysis_notes/Meta analysis notes.docx
@@ -5054,6 +5054,7 @@
                 <w:rFonts w:ascii="Calibri" w:eastAsia="SimSun" w:hAnsi="Calibri" w:cs="Calibri"/>
                 <w:sz w:val="24"/>
                 <w:szCs w:val="24"/>
+                <w:highlight w:val="yellow"/>
                 <w:lang w:val="en-US" w:eastAsia="zh-CN" w:bidi="ar"/>
               </w:rPr>
             </w:pPr>
@@ -5062,6 +5063,7 @@
                 <w:rFonts w:ascii="Calibri" w:eastAsia="SimSun" w:hAnsi="Calibri" w:cs="Calibri"/>
                 <w:sz w:val="24"/>
                 <w:szCs w:val="24"/>
+                <w:highlight w:val="yellow"/>
                 <w:lang w:val="en-US" w:eastAsia="zh-CN" w:bidi="ar"/>
               </w:rPr>
               <w:t xml:space="preserve">Removed </w:t>
@@ -5072,6 +5074,7 @@
                 <w:rFonts w:ascii="Calibri" w:eastAsia="SimSun" w:hAnsi="Calibri" w:cs="Calibri"/>
                 <w:sz w:val="24"/>
                 <w:szCs w:val="24"/>
+                <w:highlight w:val="yellow"/>
                 <w:lang w:val="en-US" w:eastAsia="zh-CN" w:bidi="ar"/>
               </w:rPr>
               <w:t>ID 3581 folder 4</w:t>
@@ -5081,6 +5084,7 @@
                 <w:rFonts w:ascii="Calibri" w:eastAsia="SimSun" w:hAnsi="Calibri" w:cs="Calibri"/>
                 <w:sz w:val="24"/>
                 <w:szCs w:val="24"/>
+                <w:highlight w:val="yellow"/>
                 <w:lang w:val="en-US" w:eastAsia="zh-CN" w:bidi="ar"/>
               </w:rPr>
               <w:t xml:space="preserve">, </w:t>
@@ -6547,6 +6551,7 @@
                 <w:rFonts w:ascii="Calibri" w:eastAsia="SimSun" w:hAnsi="Calibri" w:cs="Calibri"/>
                 <w:sz w:val="24"/>
                 <w:szCs w:val="24"/>
+                <w:highlight w:val="yellow"/>
                 <w:lang w:eastAsia="zh-CN" w:bidi="ar"/>
               </w:rPr>
             </w:pPr>
@@ -6556,6 +6561,7 @@
                 <w:rFonts w:ascii="Calibri" w:eastAsia="SimSun" w:hAnsi="Calibri" w:cs="Calibri"/>
                 <w:sz w:val="24"/>
                 <w:szCs w:val="24"/>
+                <w:highlight w:val="yellow"/>
                 <w:lang w:eastAsia="zh-CN" w:bidi="ar"/>
               </w:rPr>
               <w:t xml:space="preserve">Not Well </w:t>
@@ -6567,6 +6573,7 @@
                 <w:rFonts w:ascii="Calibri" w:eastAsia="SimSun" w:hAnsi="Calibri" w:cs="Calibri"/>
                 <w:sz w:val="24"/>
                 <w:szCs w:val="24"/>
+                <w:highlight w:val="yellow"/>
                 <w:lang w:eastAsia="zh-CN" w:bidi="ar"/>
               </w:rPr>
               <w:t>Being</w:t>
@@ -6578,6 +6585,7 @@
                 <w:rFonts w:ascii="Calibri" w:eastAsia="SimSun" w:hAnsi="Calibri" w:cs="Calibri"/>
                 <w:sz w:val="24"/>
                 <w:szCs w:val="24"/>
+                <w:highlight w:val="yellow"/>
                 <w:lang w:eastAsia="zh-CN" w:bidi="ar"/>
               </w:rPr>
               <w:t xml:space="preserve"> Study</w:t>
@@ -6596,6 +6604,7 @@
                 <w:rFonts w:ascii="Calibri" w:eastAsia="SimSun" w:hAnsi="Calibri"/>
                 <w:sz w:val="24"/>
                 <w:szCs w:val="24"/>
+                <w:highlight w:val="yellow"/>
                 <w:lang w:eastAsia="zh-CN"/>
               </w:rPr>
             </w:pPr>
@@ -6604,6 +6613,7 @@
                 <w:rFonts w:ascii="Calibri" w:eastAsia="SimSun" w:hAnsi="Calibri" w:cs="Calibri"/>
                 <w:sz w:val="24"/>
                 <w:szCs w:val="24"/>
+                <w:highlight w:val="yellow"/>
                 <w:lang w:eastAsia="zh-CN" w:bidi="ar"/>
               </w:rPr>
               <w:t xml:space="preserve">- </w:t>
@@ -6613,6 +6623,7 @@
                 <w:rFonts w:ascii="Calibri" w:eastAsia="SimSun" w:hAnsi="Calibri"/>
                 <w:sz w:val="24"/>
                 <w:szCs w:val="24"/>
+                <w:highlight w:val="yellow"/>
                 <w:lang w:eastAsia="zh-CN"/>
               </w:rPr>
               <w:t>ID 11559 (</w:t>
@@ -6623,6 +6634,7 @@
                 <w:rFonts w:ascii="Calibri" w:eastAsia="SimSun" w:hAnsi="Calibri"/>
                 <w:sz w:val="24"/>
                 <w:szCs w:val="24"/>
+                <w:highlight w:val="yellow"/>
                 <w:lang w:eastAsia="zh-CN"/>
               </w:rPr>
               <w:t>removed</w:t>
@@ -6633,6 +6645,7 @@
                 <w:rFonts w:ascii="Calibri" w:eastAsia="SimSun" w:hAnsi="Calibri"/>
                 <w:sz w:val="24"/>
                 <w:szCs w:val="24"/>
+                <w:highlight w:val="yellow"/>
                 <w:lang w:eastAsia="zh-CN"/>
               </w:rPr>
               <w:t>)</w:t>
@@ -6644,6 +6657,7 @@
                 <w:rFonts w:ascii="Calibri" w:eastAsia="SimSun" w:hAnsi="Calibri"/>
                 <w:sz w:val="24"/>
                 <w:szCs w:val="24"/>
+                <w:highlight w:val="yellow"/>
                 <w:lang w:eastAsia="zh-CN"/>
               </w:rPr>
             </w:pPr>
@@ -6652,6 +6666,7 @@
                 <w:rFonts w:ascii="Calibri" w:eastAsia="SimSun" w:hAnsi="Calibri"/>
                 <w:sz w:val="24"/>
                 <w:szCs w:val="24"/>
+                <w:highlight w:val="yellow"/>
                 <w:lang w:eastAsia="zh-CN"/>
               </w:rPr>
               <w:t>- ID 11569 (</w:t>
@@ -6662,6 +6677,7 @@
                 <w:rFonts w:ascii="Calibri" w:eastAsia="SimSun" w:hAnsi="Calibri"/>
                 <w:sz w:val="24"/>
                 <w:szCs w:val="24"/>
+                <w:highlight w:val="yellow"/>
                 <w:lang w:eastAsia="zh-CN"/>
               </w:rPr>
               <w:t>removed</w:t>
@@ -6672,6 +6688,7 @@
                 <w:rFonts w:ascii="Calibri" w:eastAsia="SimSun" w:hAnsi="Calibri"/>
                 <w:sz w:val="24"/>
                 <w:szCs w:val="24"/>
+                <w:highlight w:val="yellow"/>
                 <w:lang w:eastAsia="zh-CN"/>
               </w:rPr>
               <w:t>)</w:t>

</xml_diff>